<commit_message>
my spec for hard convolutions
</commit_message>
<xml_diff>
--- a/CIFAR/FeatureQuality.docx
+++ b/CIFAR/FeatureQuality.docx
@@ -39,6 +39,656 @@
           <w:lang w:val="en-US"/>
         </w:rPr>
         <w:t>RF – acc 34.08% eff 26.74%</w:t>
+      </w:r>
+    </w:p>
+    <w:p>
+      <w:pPr>
+        <w:rPr>
+          <w:lang w:val="en-US"/>
+        </w:rPr>
+      </w:pPr>
+    </w:p>
+    <w:p>
+      <w:r>
+        <w:t xml:space="preserve">Нужно построить консольное приложение </w:t>
+      </w:r>
+      <w:r>
+        <w:rPr>
+          <w:lang w:val="en-US"/>
+        </w:rPr>
+        <w:t>convolution</w:t>
+      </w:r>
+      <w:r>
+        <w:t xml:space="preserve">. </w:t>
+      </w:r>
+      <w:r>
+        <w:t>У него есть единственный аргумент командной строки – конфигурационный файл. Это</w:t>
+      </w:r>
+      <w:r>
+        <w:t xml:space="preserve"> </w:t>
+      </w:r>
+      <w:r>
+        <w:t>текстовый</w:t>
+      </w:r>
+      <w:r>
+        <w:t xml:space="preserve"> </w:t>
+      </w:r>
+      <w:r>
+        <w:t>файл</w:t>
+      </w:r>
+      <w:r>
+        <w:t xml:space="preserve"> </w:t>
+      </w:r>
+      <w:r>
+        <w:t>для</w:t>
+      </w:r>
+      <w:r>
+        <w:t xml:space="preserve"> </w:t>
+      </w:r>
+      <w:r>
+        <w:t>задания</w:t>
+      </w:r>
+      <w:r>
+        <w:t xml:space="preserve"> </w:t>
+      </w:r>
+      <w:r>
+        <w:t>параметров работы. Выбери сам его наиболее удобный формат (и опиши). Этот файл должен содержать следующую информацию:</w:t>
+      </w:r>
+    </w:p>
+    <w:p>
+      <w:pPr>
+        <w:pStyle w:val="ListParagraph"/>
+        <w:numPr>
+          <w:ilvl w:val="0"/>
+          <w:numId w:val="1"/>
+        </w:numPr>
+      </w:pPr>
+      <w:r>
+        <w:t>Имя входного файла. Предполагается, что этот файл содержит изображения одинакового размера в сыром байтовом виде.</w:t>
+      </w:r>
+    </w:p>
+    <w:p>
+      <w:pPr>
+        <w:pStyle w:val="ListParagraph"/>
+        <w:numPr>
+          <w:ilvl w:val="0"/>
+          <w:numId w:val="1"/>
+        </w:numPr>
+      </w:pPr>
+      <w:r>
+        <w:t>Ширина изображений в пикселях.</w:t>
+      </w:r>
+    </w:p>
+    <w:p>
+      <w:pPr>
+        <w:pStyle w:val="ListParagraph"/>
+        <w:numPr>
+          <w:ilvl w:val="0"/>
+          <w:numId w:val="1"/>
+        </w:numPr>
+      </w:pPr>
+      <w:r>
+        <w:t>Высота</w:t>
+      </w:r>
+      <w:r>
+        <w:t xml:space="preserve"> изображений в пикселях.</w:t>
+      </w:r>
+    </w:p>
+    <w:p>
+      <w:pPr>
+        <w:pStyle w:val="ListParagraph"/>
+        <w:numPr>
+          <w:ilvl w:val="0"/>
+          <w:numId w:val="1"/>
+        </w:numPr>
+      </w:pPr>
+      <w:r>
+        <w:t>Имена файлов</w:t>
+      </w:r>
+      <w:r>
+        <w:t>, содержащих наборы</w:t>
+      </w:r>
+      <w:r>
+        <w:t xml:space="preserve"> фильтров (в формате </w:t>
+      </w:r>
+      <w:r>
+        <w:rPr>
+          <w:lang w:val="en-US"/>
+        </w:rPr>
+        <w:t>PCFilters</w:t>
+      </w:r>
+      <w:r>
+        <w:t>).</w:t>
+      </w:r>
+    </w:p>
+    <w:p>
+      <w:pPr>
+        <w:pStyle w:val="ListParagraph"/>
+        <w:numPr>
+          <w:ilvl w:val="0"/>
+          <w:numId w:val="1"/>
+        </w:numPr>
+      </w:pPr>
+      <w:r>
+        <w:t xml:space="preserve">Для каждого имени файла – применяемый </w:t>
+      </w:r>
+      <w:r>
+        <w:rPr>
+          <w:lang w:val="en-US"/>
+        </w:rPr>
+        <w:t>stride</w:t>
+      </w:r>
+      <w:r>
+        <w:t>.</w:t>
+      </w:r>
+    </w:p>
+    <w:p>
+      <w:pPr>
+        <w:pStyle w:val="ListParagraph"/>
+        <w:numPr>
+          <w:ilvl w:val="0"/>
+          <w:numId w:val="1"/>
+        </w:numPr>
+      </w:pPr>
+      <w:r>
+        <w:t xml:space="preserve">Режим работы. Возможны 2 варианта – </w:t>
+      </w:r>
+      <w:r>
+        <w:rPr>
+          <w:lang w:val="en-US"/>
+        </w:rPr>
+        <w:t>def</w:t>
+      </w:r>
+      <w:r>
+        <w:t>_</w:t>
+      </w:r>
+      <w:r>
+        <w:rPr>
+          <w:lang w:val="en-US"/>
+        </w:rPr>
+        <w:t>sparsity</w:t>
+      </w:r>
+      <w:r>
+        <w:t xml:space="preserve"> </w:t>
+      </w:r>
+      <w:r>
+        <w:t xml:space="preserve">и </w:t>
+      </w:r>
+      <w:r>
+        <w:rPr>
+          <w:lang w:val="en-US"/>
+        </w:rPr>
+        <w:t>def</w:t>
+      </w:r>
+      <w:r>
+        <w:t>_</w:t>
+      </w:r>
+      <w:r>
+        <w:rPr>
+          <w:lang w:val="en-US"/>
+        </w:rPr>
+        <w:t>saturation</w:t>
+      </w:r>
+      <w:r>
+        <w:t>.</w:t>
+      </w:r>
+    </w:p>
+    <w:p>
+      <w:pPr>
+        <w:pStyle w:val="ListParagraph"/>
+        <w:numPr>
+          <w:ilvl w:val="0"/>
+          <w:numId w:val="1"/>
+        </w:numPr>
+      </w:pPr>
+      <w:r>
+        <w:t xml:space="preserve">Значение критерия – числовая величина, которая имеет разный смысл для </w:t>
+      </w:r>
+      <w:r>
+        <w:rPr>
+          <w:lang w:val="en-US"/>
+        </w:rPr>
+        <w:t>def</w:t>
+      </w:r>
+      <w:r>
+        <w:t>_</w:t>
+      </w:r>
+      <w:r>
+        <w:rPr>
+          <w:lang w:val="en-US"/>
+        </w:rPr>
+        <w:t>sparsity</w:t>
+      </w:r>
+      <w:r>
+        <w:t xml:space="preserve"> </w:t>
+      </w:r>
+      <w:r>
+        <w:t xml:space="preserve">и </w:t>
+      </w:r>
+      <w:r>
+        <w:rPr>
+          <w:lang w:val="en-US"/>
+        </w:rPr>
+        <w:t>def</w:t>
+      </w:r>
+      <w:r>
+        <w:t>_</w:t>
+      </w:r>
+      <w:r>
+        <w:rPr>
+          <w:lang w:val="en-US"/>
+        </w:rPr>
+        <w:t>saturation</w:t>
+      </w:r>
+      <w:r>
+        <w:t>.</w:t>
+      </w:r>
+    </w:p>
+    <w:p>
+      <w:pPr>
+        <w:pStyle w:val="ListParagraph"/>
+        <w:numPr>
+          <w:ilvl w:val="0"/>
+          <w:numId w:val="1"/>
+        </w:numPr>
+      </w:pPr>
+      <w:r>
+        <w:t>Имя выходного бинарного файла, содержащего числовые значения сверток.</w:t>
+      </w:r>
+    </w:p>
+    <w:p>
+      <w:pPr>
+        <w:pStyle w:val="ListParagraph"/>
+        <w:numPr>
+          <w:ilvl w:val="0"/>
+          <w:numId w:val="1"/>
+        </w:numPr>
+      </w:pPr>
+      <w:r>
+        <w:t xml:space="preserve">Имя выходного текстового файла </w:t>
+      </w:r>
+      <w:r>
+        <w:rPr>
+          <w:lang w:val="en-US"/>
+        </w:rPr>
+        <w:t>CSV</w:t>
+      </w:r>
+      <w:r>
+        <w:t xml:space="preserve">, </w:t>
+      </w:r>
+      <w:r>
+        <w:t>содержащего количества спайков (0 – 10) за период презентации изображения (равный 10) для всех позиций всех сверток – соответственно предыдущему файлу.</w:t>
+      </w:r>
+    </w:p>
+    <w:p>
+      <w:pPr>
+        <w:pStyle w:val="ListParagraph"/>
+        <w:numPr>
+          <w:ilvl w:val="0"/>
+          <w:numId w:val="1"/>
+        </w:numPr>
+      </w:pPr>
+      <w:r>
+        <w:t>Имя файла лога</w:t>
+      </w:r>
+      <w:r>
+        <w:rPr>
+          <w:lang w:val="en-US"/>
+        </w:rPr>
+        <w:t>/</w:t>
+      </w:r>
+      <w:r>
+        <w:t>результатов.</w:t>
+      </w:r>
+    </w:p>
+    <w:p>
+      <w:pPr>
+        <w:ind w:left="360"/>
+      </w:pPr>
+      <w:r>
+        <w:t>Приложение должно</w:t>
+      </w:r>
+      <w:r>
+        <w:t xml:space="preserve"> дела</w:t>
+      </w:r>
+      <w:r>
+        <w:t>ть</w:t>
+      </w:r>
+      <w:r>
+        <w:t xml:space="preserve"> следующее</w:t>
+      </w:r>
+      <w:r>
+        <w:t>:</w:t>
+      </w:r>
+    </w:p>
+    <w:p>
+      <w:pPr>
+        <w:pStyle w:val="ListParagraph"/>
+        <w:numPr>
+          <w:ilvl w:val="0"/>
+          <w:numId w:val="2"/>
+        </w:numPr>
+      </w:pPr>
+      <w:r>
+        <w:t xml:space="preserve">Прочесть входной файл изображений (предполагается, что они все умещаются в </w:t>
+      </w:r>
+      <w:r>
+        <w:rPr>
+          <w:lang w:val="en-US"/>
+        </w:rPr>
+        <w:t>RAM</w:t>
+      </w:r>
+      <w:r>
+        <w:t>).</w:t>
+      </w:r>
+    </w:p>
+    <w:p>
+      <w:pPr>
+        <w:pStyle w:val="ListParagraph"/>
+        <w:numPr>
+          <w:ilvl w:val="0"/>
+          <w:numId w:val="2"/>
+        </w:numPr>
+      </w:pPr>
+      <w:r>
+        <w:t>Загрузить фильтры из файлов.</w:t>
+      </w:r>
+    </w:p>
+    <w:p>
+      <w:pPr>
+        <w:pStyle w:val="ListParagraph"/>
+        <w:numPr>
+          <w:ilvl w:val="0"/>
+          <w:numId w:val="2"/>
+        </w:numPr>
+      </w:pPr>
+      <w:r>
+        <w:t xml:space="preserve">Для каждого изображения и для каждого фильтра построить свертки изображений с фильтрами, используя заданный </w:t>
+      </w:r>
+      <w:r>
+        <w:rPr>
+          <w:lang w:val="en-US"/>
+        </w:rPr>
+        <w:t>stride</w:t>
+      </w:r>
+      <w:r>
+        <w:t xml:space="preserve"> (</w:t>
+      </w:r>
+      <w:r>
+        <w:t>фильтры не должны заходить за границы изображений).</w:t>
+      </w:r>
+    </w:p>
+    <w:p>
+      <w:pPr>
+        <w:pStyle w:val="ListParagraph"/>
+        <w:numPr>
+          <w:ilvl w:val="0"/>
+          <w:numId w:val="2"/>
+        </w:numPr>
+      </w:pPr>
+      <w:r>
+        <w:t>Для каждого фильтра строить свертки с ним и с ним со знаком минус. Во всех свертках отрицательные значения заменять нулями. Таким образом, для каждого фильтра будет две свертки – обе с неотрицательными значениями.</w:t>
+      </w:r>
+    </w:p>
+    <w:p>
+      <w:pPr>
+        <w:pStyle w:val="ListParagraph"/>
+        <w:numPr>
+          <w:ilvl w:val="0"/>
+          <w:numId w:val="2"/>
+        </w:numPr>
+      </w:pPr>
+      <w:r>
+        <w:t xml:space="preserve">Каждое значение свертки проецируется на целое число в </w:t>
+      </w:r>
+      <w:r>
+        <w:t>[0, 10]</w:t>
+      </w:r>
+      <w:r>
+        <w:t xml:space="preserve">, интерпретируемое как число </w:t>
+      </w:r>
+      <w:r>
+        <w:t xml:space="preserve">спайков для данной позиции свертки за время предъявления данного изображения. Это линейная проекция из </w:t>
+      </w:r>
+      <w:r>
+        <w:t xml:space="preserve">[0, </w:t>
+      </w:r>
+      <w:r>
+        <w:rPr>
+          <w:lang w:val="en-US"/>
+        </w:rPr>
+        <w:t>Vmax</w:t>
+      </w:r>
+      <w:r>
+        <w:t xml:space="preserve">] </w:t>
+      </w:r>
+      <w:r>
+        <w:t xml:space="preserve">в ближайшее целое из </w:t>
+      </w:r>
+      <w:r>
+        <w:t>[0, 10]</w:t>
+      </w:r>
+      <w:r>
+        <w:t xml:space="preserve">. Значения, большие </w:t>
+      </w:r>
+      <w:r>
+        <w:rPr>
+          <w:lang w:val="en-US"/>
+        </w:rPr>
+        <w:t>Vmax</w:t>
+      </w:r>
+      <w:r>
+        <w:t xml:space="preserve">, проецируются в 10. </w:t>
+      </w:r>
+      <w:r>
+        <w:rPr>
+          <w:lang w:val="en-US"/>
+        </w:rPr>
+        <w:t>Vmax</w:t>
+      </w:r>
+      <w:r>
+        <w:t xml:space="preserve"> рассчитывается для каждого фильтра. Для режима </w:t>
+      </w:r>
+      <w:r>
+        <w:rPr>
+          <w:lang w:val="en-US"/>
+        </w:rPr>
+        <w:t>def</w:t>
+      </w:r>
+      <w:r>
+        <w:t>_</w:t>
+      </w:r>
+      <w:r>
+        <w:rPr>
+          <w:lang w:val="en-US"/>
+        </w:rPr>
+        <w:t>sparsity</w:t>
+      </w:r>
+      <w:r>
+        <w:t xml:space="preserve"> </w:t>
+      </w:r>
+      <w:r>
+        <w:rPr>
+          <w:lang w:val="en-US"/>
+        </w:rPr>
+        <w:t>Vmax</w:t>
+      </w:r>
+      <w:r>
+        <w:t xml:space="preserve"> рассчитывается так, чтобы среднее число спайков для всех сверток с данным фильтром</w:t>
+      </w:r>
+      <w:r>
+        <w:t xml:space="preserve"> по всем изображениям</w:t>
+      </w:r>
+      <w:r>
+        <w:t xml:space="preserve"> было равно заданному значению (см. п. 7</w:t>
+      </w:r>
+      <w:r>
+        <w:t xml:space="preserve"> выше</w:t>
+      </w:r>
+      <w:r>
+        <w:t xml:space="preserve">). </w:t>
+      </w:r>
+      <w:r>
+        <w:t xml:space="preserve">Для режима </w:t>
+      </w:r>
+      <w:r>
+        <w:rPr>
+          <w:lang w:val="en-US"/>
+        </w:rPr>
+        <w:t>def</w:t>
+      </w:r>
+      <w:r>
+        <w:t>_</w:t>
+      </w:r>
+      <w:r>
+        <w:rPr>
+          <w:lang w:val="en-US"/>
+        </w:rPr>
+        <w:t>saturation</w:t>
+      </w:r>
+      <w:r>
+        <w:t xml:space="preserve"> </w:t>
+      </w:r>
+      <w:r>
+        <w:rPr>
+          <w:lang w:val="en-US"/>
+        </w:rPr>
+        <w:t>Vmax</w:t>
+      </w:r>
+      <w:r>
+        <w:t xml:space="preserve"> </w:t>
+      </w:r>
+      <w:r>
+        <w:t>таково, что число значений сверток, больших</w:t>
+      </w:r>
+      <w:r>
+        <w:t>,</w:t>
+      </w:r>
+      <w:r>
+        <w:t xml:space="preserve"> чем </w:t>
+      </w:r>
+      <w:r>
+        <w:rPr>
+          <w:lang w:val="en-US"/>
+        </w:rPr>
+        <w:t>Vmax</w:t>
+      </w:r>
+      <w:r>
+        <w:t xml:space="preserve">, </w:t>
+      </w:r>
+      <w:r>
+        <w:t>составляло часть всех значений, максимально близкую</w:t>
+      </w:r>
+      <w:r>
+        <w:t xml:space="preserve"> заданному значению (см. п. 7</w:t>
+      </w:r>
+      <w:r>
+        <w:t xml:space="preserve"> выше</w:t>
+      </w:r>
+      <w:r>
+        <w:t>).</w:t>
+      </w:r>
+    </w:p>
+    <w:p>
+      <w:pPr>
+        <w:pStyle w:val="ListParagraph"/>
+        <w:numPr>
+          <w:ilvl w:val="0"/>
+          <w:numId w:val="2"/>
+        </w:numPr>
+      </w:pPr>
+      <w:r>
+        <w:t xml:space="preserve">Для режима </w:t>
+      </w:r>
+      <w:r>
+        <w:rPr>
+          <w:lang w:val="en-US"/>
+        </w:rPr>
+        <w:t>def</w:t>
+      </w:r>
+      <w:r>
+        <w:t>_</w:t>
+      </w:r>
+      <w:r>
+        <w:rPr>
+          <w:lang w:val="en-US"/>
+        </w:rPr>
+        <w:t>sparsity</w:t>
+      </w:r>
+      <w:r>
+        <w:t xml:space="preserve"> нужно для каждого фильтра вывести</w:t>
+      </w:r>
+      <w:r>
+        <w:t xml:space="preserve"> </w:t>
+      </w:r>
+      <w:r>
+        <w:rPr>
+          <w:lang w:val="en-US"/>
+        </w:rPr>
+        <w:t>Vmax</w:t>
+      </w:r>
+      <w:r>
+        <w:t xml:space="preserve"> и долю значений сверток, больших </w:t>
+      </w:r>
+      <w:r>
+        <w:rPr>
+          <w:lang w:val="en-US"/>
+        </w:rPr>
+        <w:t>Vmax</w:t>
+      </w:r>
+      <w:r>
+        <w:t>.</w:t>
+      </w:r>
+      <w:r>
+        <w:t xml:space="preserve"> Для режима </w:t>
+      </w:r>
+      <w:r>
+        <w:rPr>
+          <w:lang w:val="en-US"/>
+        </w:rPr>
+        <w:t>def</w:t>
+      </w:r>
+      <w:r>
+        <w:t>_</w:t>
+      </w:r>
+      <w:r>
+        <w:rPr>
+          <w:lang w:val="en-US"/>
+        </w:rPr>
+        <w:t>saturation</w:t>
+      </w:r>
+      <w:r>
+        <w:t xml:space="preserve"> нужно для каждого фильтра вывести </w:t>
+      </w:r>
+      <w:r>
+        <w:rPr>
+          <w:lang w:val="en-US"/>
+        </w:rPr>
+        <w:t>Vmax</w:t>
+      </w:r>
+      <w:r>
+        <w:t xml:space="preserve"> и </w:t>
+      </w:r>
+      <w:r>
+        <w:t xml:space="preserve">среднее число спайков </w:t>
+      </w:r>
+      <w:r>
+        <w:t>для всех сверток с данным фильтром по всем изображениям</w:t>
+      </w:r>
+      <w:r>
+        <w:t>.</w:t>
+      </w:r>
+    </w:p>
+    <w:p>
+      <w:pPr>
+        <w:pStyle w:val="ListParagraph"/>
+        <w:numPr>
+          <w:ilvl w:val="0"/>
+          <w:numId w:val="2"/>
+        </w:numPr>
+      </w:pPr>
+      <w:r>
+        <w:t>Сохранить значения сверток в файлах для пп. 8 и 9.</w:t>
       </w:r>
     </w:p>
     <w:sectPr>
@@ -49,6 +699,195 @@
     </w:sectPr>
   </w:body>
 </w:document>
+</file>
+
+<file path=word/numbering.xml><?xml version="1.0" encoding="utf-8"?>
+<w:numbering xmlns:wpc="http://schemas.microsoft.com/office/word/2010/wordprocessingCanvas" xmlns:cx="http://schemas.microsoft.com/office/drawing/2014/chartex" xmlns:cx1="http://schemas.microsoft.com/office/drawing/2015/9/8/chartex" xmlns:cx2="http://schemas.microsoft.com/office/drawing/2015/10/21/chartex" xmlns:cx3="http://schemas.microsoft.com/office/drawing/2016/5/9/chartex" xmlns:cx4="http://schemas.microsoft.com/office/drawing/2016/5/10/chartex" xmlns:cx5="http://schemas.microsoft.com/office/drawing/2016/5/11/chartex" xmlns:cx6="http://schemas.microsoft.com/office/drawing/2016/5/12/chartex" xmlns:cx7="http://schemas.microsoft.com/office/drawing/2016/5/13/chartex" xmlns:cx8="http://schemas.microsoft.com/office/drawing/2016/5/14/chartex" xmlns:mc="http://schemas.openxmlformats.org/markup-compatibility/2006" xmlns:aink="http://schemas.microsoft.com/office/drawing/2016/ink" xmlns:am3d="http://schemas.microsoft.com/office/drawing/2017/model3d" xmlns:o="urn:schemas-microsoft-com:office:office" xmlns:r="http://schemas.openxmlformats.org/officeDocument/2006/relationships" xmlns:m="http://schemas.openxmlformats.org/officeDocument/2006/math" xmlns:v="urn:schemas-microsoft-com:vml" xmlns:wp14="http://schemas.microsoft.com/office/word/2010/wordprocessingDrawing" xmlns:wp="http://schemas.openxmlformats.org/drawingml/2006/wordprocessingDrawing" xmlns:w10="urn:schemas-microsoft-com:office:word" xmlns:w="http://schemas.openxmlformats.org/wordprocessingml/2006/main" xmlns:w14="http://schemas.microsoft.com/office/word/2010/wordml" xmlns:w15="http://schemas.microsoft.com/office/word/2012/wordml" xmlns:w16cex="http://schemas.microsoft.com/office/word/2018/wordml/cex" xmlns:w16cid="http://schemas.microsoft.com/office/word/2016/wordml/cid" xmlns:w16="http://schemas.microsoft.com/office/word/2018/wordml" xmlns:w16sdtdh="http://schemas.microsoft.com/office/word/2020/wordml/sdtdatahash" xmlns:w16se="http://schemas.microsoft.com/office/word/2015/wordml/symex" xmlns:wpg="http://schemas.microsoft.com/office/word/2010/wordprocessingGroup" xmlns:wpi="http://schemas.microsoft.com/office/word/2010/wordprocessingInk" xmlns:wne="http://schemas.microsoft.com/office/word/2006/wordml" xmlns:wps="http://schemas.microsoft.com/office/word/2010/wordprocessingShape" mc:Ignorable="w14 w15 w16se w16cid w16 w16cex w16sdtdh wp14">
+  <w:abstractNum w:abstractNumId="0" w15:restartNumberingAfterBreak="0">
+    <w:nsid w:val="07A60FC9"/>
+    <w:multiLevelType w:val="hybridMultilevel"/>
+    <w:tmpl w:val="9C3640C8"/>
+    <w:lvl w:ilvl="0" w:tplc="9D32F9AA">
+      <w:start w:val="1"/>
+      <w:numFmt w:val="decimal"/>
+      <w:lvlText w:val="%1."/>
+      <w:lvlJc w:val="left"/>
+      <w:pPr>
+        <w:ind w:left="720" w:hanging="360"/>
+      </w:pPr>
+      <w:rPr>
+        <w:rFonts w:hint="default"/>
+      </w:rPr>
+    </w:lvl>
+    <w:lvl w:ilvl="1" w:tplc="04190019" w:tentative="1">
+      <w:start w:val="1"/>
+      <w:numFmt w:val="lowerLetter"/>
+      <w:lvlText w:val="%2."/>
+      <w:lvlJc w:val="left"/>
+      <w:pPr>
+        <w:ind w:left="1440" w:hanging="360"/>
+      </w:pPr>
+    </w:lvl>
+    <w:lvl w:ilvl="2" w:tplc="0419001B" w:tentative="1">
+      <w:start w:val="1"/>
+      <w:numFmt w:val="lowerRoman"/>
+      <w:lvlText w:val="%3."/>
+      <w:lvlJc w:val="right"/>
+      <w:pPr>
+        <w:ind w:left="2160" w:hanging="180"/>
+      </w:pPr>
+    </w:lvl>
+    <w:lvl w:ilvl="3" w:tplc="0419000F" w:tentative="1">
+      <w:start w:val="1"/>
+      <w:numFmt w:val="decimal"/>
+      <w:lvlText w:val="%4."/>
+      <w:lvlJc w:val="left"/>
+      <w:pPr>
+        <w:ind w:left="2880" w:hanging="360"/>
+      </w:pPr>
+    </w:lvl>
+    <w:lvl w:ilvl="4" w:tplc="04190019" w:tentative="1">
+      <w:start w:val="1"/>
+      <w:numFmt w:val="lowerLetter"/>
+      <w:lvlText w:val="%5."/>
+      <w:lvlJc w:val="left"/>
+      <w:pPr>
+        <w:ind w:left="3600" w:hanging="360"/>
+      </w:pPr>
+    </w:lvl>
+    <w:lvl w:ilvl="5" w:tplc="0419001B" w:tentative="1">
+      <w:start w:val="1"/>
+      <w:numFmt w:val="lowerRoman"/>
+      <w:lvlText w:val="%6."/>
+      <w:lvlJc w:val="right"/>
+      <w:pPr>
+        <w:ind w:left="4320" w:hanging="180"/>
+      </w:pPr>
+    </w:lvl>
+    <w:lvl w:ilvl="6" w:tplc="0419000F" w:tentative="1">
+      <w:start w:val="1"/>
+      <w:numFmt w:val="decimal"/>
+      <w:lvlText w:val="%7."/>
+      <w:lvlJc w:val="left"/>
+      <w:pPr>
+        <w:ind w:left="5040" w:hanging="360"/>
+      </w:pPr>
+    </w:lvl>
+    <w:lvl w:ilvl="7" w:tplc="04190019" w:tentative="1">
+      <w:start w:val="1"/>
+      <w:numFmt w:val="lowerLetter"/>
+      <w:lvlText w:val="%8."/>
+      <w:lvlJc w:val="left"/>
+      <w:pPr>
+        <w:ind w:left="5760" w:hanging="360"/>
+      </w:pPr>
+    </w:lvl>
+    <w:lvl w:ilvl="8" w:tplc="0419001B" w:tentative="1">
+      <w:start w:val="1"/>
+      <w:numFmt w:val="lowerRoman"/>
+      <w:lvlText w:val="%9."/>
+      <w:lvlJc w:val="right"/>
+      <w:pPr>
+        <w:ind w:left="6480" w:hanging="180"/>
+      </w:pPr>
+    </w:lvl>
+  </w:abstractNum>
+  <w:abstractNum w:abstractNumId="1" w15:restartNumberingAfterBreak="0">
+    <w:nsid w:val="61151E5D"/>
+    <w:multiLevelType w:val="hybridMultilevel"/>
+    <w:tmpl w:val="86C48580"/>
+    <w:lvl w:ilvl="0" w:tplc="9D32F9AA">
+      <w:start w:val="1"/>
+      <w:numFmt w:val="decimal"/>
+      <w:lvlText w:val="%1."/>
+      <w:lvlJc w:val="left"/>
+      <w:pPr>
+        <w:ind w:left="720" w:hanging="360"/>
+      </w:pPr>
+      <w:rPr>
+        <w:rFonts w:hint="default"/>
+      </w:rPr>
+    </w:lvl>
+    <w:lvl w:ilvl="1" w:tplc="04190019" w:tentative="1">
+      <w:start w:val="1"/>
+      <w:numFmt w:val="lowerLetter"/>
+      <w:lvlText w:val="%2."/>
+      <w:lvlJc w:val="left"/>
+      <w:pPr>
+        <w:ind w:left="1440" w:hanging="360"/>
+      </w:pPr>
+    </w:lvl>
+    <w:lvl w:ilvl="2" w:tplc="0419001B" w:tentative="1">
+      <w:start w:val="1"/>
+      <w:numFmt w:val="lowerRoman"/>
+      <w:lvlText w:val="%3."/>
+      <w:lvlJc w:val="right"/>
+      <w:pPr>
+        <w:ind w:left="2160" w:hanging="180"/>
+      </w:pPr>
+    </w:lvl>
+    <w:lvl w:ilvl="3" w:tplc="0419000F" w:tentative="1">
+      <w:start w:val="1"/>
+      <w:numFmt w:val="decimal"/>
+      <w:lvlText w:val="%4."/>
+      <w:lvlJc w:val="left"/>
+      <w:pPr>
+        <w:ind w:left="2880" w:hanging="360"/>
+      </w:pPr>
+    </w:lvl>
+    <w:lvl w:ilvl="4" w:tplc="04190019" w:tentative="1">
+      <w:start w:val="1"/>
+      <w:numFmt w:val="lowerLetter"/>
+      <w:lvlText w:val="%5."/>
+      <w:lvlJc w:val="left"/>
+      <w:pPr>
+        <w:ind w:left="3600" w:hanging="360"/>
+      </w:pPr>
+    </w:lvl>
+    <w:lvl w:ilvl="5" w:tplc="0419001B" w:tentative="1">
+      <w:start w:val="1"/>
+      <w:numFmt w:val="lowerRoman"/>
+      <w:lvlText w:val="%6."/>
+      <w:lvlJc w:val="right"/>
+      <w:pPr>
+        <w:ind w:left="4320" w:hanging="180"/>
+      </w:pPr>
+    </w:lvl>
+    <w:lvl w:ilvl="6" w:tplc="0419000F" w:tentative="1">
+      <w:start w:val="1"/>
+      <w:numFmt w:val="decimal"/>
+      <w:lvlText w:val="%7."/>
+      <w:lvlJc w:val="left"/>
+      <w:pPr>
+        <w:ind w:left="5040" w:hanging="360"/>
+      </w:pPr>
+    </w:lvl>
+    <w:lvl w:ilvl="7" w:tplc="04190019" w:tentative="1">
+      <w:start w:val="1"/>
+      <w:numFmt w:val="lowerLetter"/>
+      <w:lvlText w:val="%8."/>
+      <w:lvlJc w:val="left"/>
+      <w:pPr>
+        <w:ind w:left="5760" w:hanging="360"/>
+      </w:pPr>
+    </w:lvl>
+    <w:lvl w:ilvl="8" w:tplc="0419001B" w:tentative="1">
+      <w:start w:val="1"/>
+      <w:numFmt w:val="lowerRoman"/>
+      <w:lvlText w:val="%9."/>
+      <w:lvlJc w:val="right"/>
+      <w:pPr>
+        <w:ind w:left="6480" w:hanging="180"/>
+      </w:pPr>
+    </w:lvl>
+  </w:abstractNum>
+  <w:num w:numId="1">
+    <w:abstractNumId w:val="0"/>
+  </w:num>
+  <w:num w:numId="2">
+    <w:abstractNumId w:val="1"/>
+  </w:num>
+</w:numbering>
 </file>
 
 <file path=word/styles.xml><?xml version="1.0" encoding="utf-8"?>
@@ -174,6 +1013,7 @@
     <w:lsdException w:name="HTML Sample" w:semiHidden="1" w:unhideWhenUsed="1"/>
     <w:lsdException w:name="HTML Typewriter" w:semiHidden="1" w:unhideWhenUsed="1"/>
     <w:lsdException w:name="HTML Variable" w:semiHidden="1" w:unhideWhenUsed="1"/>
+    <w:lsdException w:name="Normal Table" w:semiHidden="1" w:unhideWhenUsed="1"/>
     <w:lsdException w:name="annotation subject" w:semiHidden="1" w:unhideWhenUsed="1"/>
     <w:lsdException w:name="No List" w:semiHidden="1" w:unhideWhenUsed="1"/>
     <w:lsdException w:name="Outline List 1" w:semiHidden="1" w:unhideWhenUsed="1"/>
@@ -220,8 +1060,10 @@
     <w:lsdException w:name="Table Subtle 2" w:semiHidden="1" w:unhideWhenUsed="1"/>
     <w:lsdException w:name="Table Web 1" w:semiHidden="1" w:unhideWhenUsed="1"/>
     <w:lsdException w:name="Table Web 2" w:semiHidden="1" w:unhideWhenUsed="1"/>
+    <w:lsdException w:name="Table Web 3" w:semiHidden="1" w:unhideWhenUsed="1"/>
     <w:lsdException w:name="Balloon Text" w:semiHidden="1" w:unhideWhenUsed="1"/>
     <w:lsdException w:name="Table Grid" w:uiPriority="39"/>
+    <w:lsdException w:name="Table Theme" w:semiHidden="1" w:unhideWhenUsed="1"/>
     <w:lsdException w:name="Placeholder Text" w:semiHidden="1"/>
     <w:lsdException w:name="No Spacing" w:uiPriority="1" w:qFormat="1"/>
     <w:lsdException w:name="Light Shading" w:uiPriority="60"/>
@@ -473,6 +1315,17 @@
     <w:uiPriority w:val="99"/>
     <w:semiHidden/>
     <w:unhideWhenUsed/>
+  </w:style>
+  <w:style w:type="paragraph" w:styleId="ListParagraph">
+    <w:name w:val="List Paragraph"/>
+    <w:basedOn w:val="Normal"/>
+    <w:uiPriority w:val="34"/>
+    <w:qFormat/>
+    <w:rsid w:val="00BD050C"/>
+    <w:pPr>
+      <w:ind w:left="720"/>
+      <w:contextualSpacing/>
+    </w:pPr>
   </w:style>
 </w:styles>
 </file>

</xml_diff>

<commit_message>
before using primary filters
</commit_message>
<xml_diff>
--- a/CIFAR/FeatureQuality.docx
+++ b/CIFAR/FeatureQuality.docx
@@ -38,15 +38,435 @@
         <w:rPr>
           <w:lang w:val="en-US"/>
         </w:rPr>
-        <w:t>RF – acc 34.08% eff 26.74%</w:t>
-      </w:r>
-    </w:p>
-    <w:p>
-      <w:pPr>
-        <w:rPr>
-          <w:lang w:val="en-US"/>
-        </w:rPr>
-      </w:pPr>
+        <w:t>RF</w:t>
+      </w:r>
+      <w:r>
+        <w:rPr>
+          <w:lang w:val="en-US"/>
+        </w:rPr>
+        <w:t>10</w:t>
+      </w:r>
+      <w:r>
+        <w:rPr>
+          <w:lang w:val="en-US"/>
+        </w:rPr>
+        <w:t xml:space="preserve"> – </w:t>
+      </w:r>
+      <w:r>
+        <w:rPr>
+          <w:lang w:val="en-US"/>
+        </w:rPr>
+        <w:t>acc</w:t>
+      </w:r>
+      <w:r>
+        <w:rPr>
+          <w:lang w:val="en-US"/>
+        </w:rPr>
+        <w:t xml:space="preserve"> 3</w:t>
+      </w:r>
+      <w:r>
+        <w:rPr>
+          <w:lang w:val="en-US"/>
+        </w:rPr>
+        <w:t>3</w:t>
+      </w:r>
+      <w:r>
+        <w:rPr>
+          <w:lang w:val="en-US"/>
+        </w:rPr>
+        <w:t>.</w:t>
+      </w:r>
+      <w:r>
+        <w:rPr>
+          <w:lang w:val="en-US"/>
+        </w:rPr>
+        <w:t>6</w:t>
+      </w:r>
+      <w:r>
+        <w:rPr>
+          <w:lang w:val="en-US"/>
+        </w:rPr>
+        <w:t xml:space="preserve">8% </w:t>
+      </w:r>
+      <w:r>
+        <w:rPr>
+          <w:lang w:val="en-US"/>
+        </w:rPr>
+        <w:t>eff</w:t>
+      </w:r>
+      <w:r>
+        <w:rPr>
+          <w:lang w:val="en-US"/>
+        </w:rPr>
+        <w:t xml:space="preserve"> 26.</w:t>
+      </w:r>
+      <w:r>
+        <w:rPr>
+          <w:lang w:val="en-US"/>
+        </w:rPr>
+        <w:t>3</w:t>
+      </w:r>
+      <w:r>
+        <w:rPr>
+          <w:lang w:val="en-US"/>
+        </w:rPr>
+        <w:t>%</w:t>
+      </w:r>
+    </w:p>
+    <w:p>
+      <w:pPr>
+        <w:rPr>
+          <w:lang w:val="en-US"/>
+        </w:rPr>
+      </w:pPr>
+      <w:r>
+        <w:rPr>
+          <w:lang w:val="en-US"/>
+        </w:rPr>
+        <w:t>Filters 3, 6, 12</w:t>
+      </w:r>
+      <w:r>
+        <w:rPr>
+          <w:lang w:val="en-US"/>
+        </w:rPr>
+        <w:t>:</w:t>
+      </w:r>
+    </w:p>
+    <w:p>
+      <w:pPr>
+        <w:rPr>
+          <w:lang w:val="en-US"/>
+        </w:rPr>
+      </w:pPr>
+      <w:r>
+        <w:rPr>
+          <w:lang w:val="en-US"/>
+        </w:rPr>
+        <w:t>CNN – acc 5</w:t>
+      </w:r>
+      <w:r>
+        <w:rPr>
+          <w:lang w:val="en-US"/>
+        </w:rPr>
+        <w:t>9</w:t>
+      </w:r>
+      <w:r>
+        <w:rPr>
+          <w:lang w:val="en-US"/>
+        </w:rPr>
+        <w:t>.1</w:t>
+      </w:r>
+      <w:r>
+        <w:rPr>
+          <w:lang w:val="en-US"/>
+        </w:rPr>
+        <w:t>1</w:t>
+      </w:r>
+      <w:r>
+        <w:rPr>
+          <w:lang w:val="en-US"/>
+        </w:rPr>
+        <w:t xml:space="preserve">% eff </w:t>
+      </w:r>
+      <w:r>
+        <w:rPr>
+          <w:lang w:val="en-US"/>
+        </w:rPr>
+        <w:t>54</w:t>
+      </w:r>
+      <w:r>
+        <w:rPr>
+          <w:lang w:val="en-US"/>
+        </w:rPr>
+        <w:t>.</w:t>
+      </w:r>
+      <w:r>
+        <w:rPr>
+          <w:lang w:val="en-US"/>
+        </w:rPr>
+        <w:t>57</w:t>
+      </w:r>
+      <w:r>
+        <w:rPr>
+          <w:lang w:val="en-US"/>
+        </w:rPr>
+        <w:t>%</w:t>
+      </w:r>
+    </w:p>
+    <w:p>
+      <w:pPr>
+        <w:rPr>
+          <w:lang w:val="en-US"/>
+        </w:rPr>
+      </w:pPr>
+      <w:r>
+        <w:rPr>
+          <w:lang w:val="en-US"/>
+        </w:rPr>
+        <w:t>RF10</w:t>
+      </w:r>
+      <w:r>
+        <w:rPr>
+          <w:lang w:val="en-US"/>
+        </w:rPr>
+        <w:t xml:space="preserve"> – </w:t>
+      </w:r>
+      <w:r>
+        <w:rPr>
+          <w:lang w:val="en-US"/>
+        </w:rPr>
+        <w:t>acc</w:t>
+      </w:r>
+      <w:r>
+        <w:rPr>
+          <w:lang w:val="en-US"/>
+        </w:rPr>
+        <w:t xml:space="preserve"> 3</w:t>
+      </w:r>
+      <w:r>
+        <w:rPr>
+          <w:lang w:val="en-US"/>
+        </w:rPr>
+        <w:t>3</w:t>
+      </w:r>
+      <w:r>
+        <w:rPr>
+          <w:lang w:val="en-US"/>
+        </w:rPr>
+        <w:t>.</w:t>
+      </w:r>
+      <w:r>
+        <w:rPr>
+          <w:lang w:val="en-US"/>
+        </w:rPr>
+        <w:t>54</w:t>
+      </w:r>
+      <w:r>
+        <w:rPr>
+          <w:lang w:val="en-US"/>
+        </w:rPr>
+        <w:t xml:space="preserve">% </w:t>
+      </w:r>
+      <w:r>
+        <w:rPr>
+          <w:lang w:val="en-US"/>
+        </w:rPr>
+        <w:t>eff</w:t>
+      </w:r>
+      <w:r>
+        <w:rPr>
+          <w:lang w:val="en-US"/>
+        </w:rPr>
+        <w:t xml:space="preserve"> 26.</w:t>
+      </w:r>
+      <w:r>
+        <w:rPr>
+          <w:lang w:val="en-US"/>
+        </w:rPr>
+        <w:t>16</w:t>
+      </w:r>
+      <w:r>
+        <w:rPr>
+          <w:lang w:val="en-US"/>
+        </w:rPr>
+        <w:t>%</w:t>
+      </w:r>
+    </w:p>
+    <w:p>
+      <w:pPr>
+        <w:rPr>
+          <w:lang w:val="en-US"/>
+        </w:rPr>
+      </w:pPr>
+      <w:r>
+        <w:rPr>
+          <w:lang w:val="en-US"/>
+        </w:rPr>
+        <w:t>Scaled filters 3x3</w:t>
+      </w:r>
+      <w:r>
+        <w:rPr>
+          <w:lang w:val="en-US"/>
+        </w:rPr>
+        <w:t>:</w:t>
+      </w:r>
+    </w:p>
+    <w:p>
+      <w:pPr>
+        <w:rPr>
+          <w:lang w:val="en-US"/>
+        </w:rPr>
+      </w:pPr>
+      <w:r>
+        <w:rPr>
+          <w:lang w:val="en-US"/>
+        </w:rPr>
+        <w:t>CNN – acc 5</w:t>
+      </w:r>
+      <w:r>
+        <w:rPr>
+          <w:lang w:val="en-US"/>
+        </w:rPr>
+        <w:t>9</w:t>
+      </w:r>
+      <w:r>
+        <w:rPr>
+          <w:lang w:val="en-US"/>
+        </w:rPr>
+        <w:t>.</w:t>
+      </w:r>
+      <w:r>
+        <w:rPr>
+          <w:lang w:val="en-US"/>
+        </w:rPr>
+        <w:t>55</w:t>
+      </w:r>
+      <w:r>
+        <w:rPr>
+          <w:lang w:val="en-US"/>
+        </w:rPr>
+        <w:t xml:space="preserve">% eff </w:t>
+      </w:r>
+      <w:r>
+        <w:rPr>
+          <w:lang w:val="en-US"/>
+        </w:rPr>
+        <w:t>59</w:t>
+      </w:r>
+      <w:r>
+        <w:rPr>
+          <w:lang w:val="en-US"/>
+        </w:rPr>
+        <w:t>.</w:t>
+      </w:r>
+      <w:r>
+        <w:rPr>
+          <w:lang w:val="en-US"/>
+        </w:rPr>
+        <w:t>06</w:t>
+      </w:r>
+      <w:r>
+        <w:rPr>
+          <w:lang w:val="en-US"/>
+        </w:rPr>
+        <w:t>%</w:t>
+      </w:r>
+    </w:p>
+    <w:p>
+      <w:r>
+        <w:rPr>
+          <w:lang w:val="en-US"/>
+        </w:rPr>
+        <w:t>RF</w:t>
+      </w:r>
+      <w:r>
+        <w:t xml:space="preserve">10 – </w:t>
+      </w:r>
+      <w:r>
+        <w:rPr>
+          <w:lang w:val="en-US"/>
+        </w:rPr>
+        <w:t>acc</w:t>
+      </w:r>
+      <w:r>
+        <w:t xml:space="preserve"> 3</w:t>
+      </w:r>
+      <w:r>
+        <w:t>4</w:t>
+      </w:r>
+      <w:r>
+        <w:t>.6</w:t>
+      </w:r>
+      <w:r>
+        <w:t>6</w:t>
+      </w:r>
+      <w:r>
+        <w:t xml:space="preserve">% </w:t>
+      </w:r>
+      <w:r>
+        <w:rPr>
+          <w:lang w:val="en-US"/>
+        </w:rPr>
+        <w:t>eff</w:t>
+      </w:r>
+      <w:r>
+        <w:t xml:space="preserve"> 2</w:t>
+      </w:r>
+      <w:r>
+        <w:t>7</w:t>
+      </w:r>
+      <w:r>
+        <w:t>.</w:t>
+      </w:r>
+      <w:r>
+        <w:t>4</w:t>
+      </w:r>
+      <w:r>
+        <w:t>%</w:t>
+      </w:r>
+    </w:p>
+    <w:p>
+      <w:pPr>
+        <w:rPr>
+          <w:lang w:val="en-US"/>
+        </w:rPr>
+      </w:pPr>
+      <w:r>
+        <w:rPr>
+          <w:lang w:val="en-US"/>
+        </w:rPr>
+        <w:t>Filters 3x3 obtained for different scales</w:t>
+      </w:r>
+    </w:p>
+    <w:p>
+      <w:pPr>
+        <w:rPr>
+          <w:lang w:val="en-US"/>
+        </w:rPr>
+      </w:pPr>
+      <w:r>
+        <w:rPr>
+          <w:lang w:val="en-US"/>
+        </w:rPr>
+        <w:t xml:space="preserve">CNN – acc </w:t>
+      </w:r>
+      <w:r>
+        <w:rPr>
+          <w:lang w:val="en-US"/>
+        </w:rPr>
+        <w:t>58.05%</w:t>
+      </w:r>
+      <w:r>
+        <w:rPr>
+          <w:lang w:val="en-US"/>
+        </w:rPr>
+        <w:t xml:space="preserve"> eff</w:t>
+      </w:r>
+      <w:r>
+        <w:rPr>
+          <w:lang w:val="en-US"/>
+        </w:rPr>
+        <w:t xml:space="preserve"> 53.</w:t>
+      </w:r>
+      <w:r>
+        <w:rPr>
+          <w:lang w:val="en-US"/>
+        </w:rPr>
+        <w:t>39%</w:t>
+      </w:r>
+    </w:p>
+    <w:p>
+      <w:pPr>
+        <w:rPr>
+          <w:lang w:val="en-US"/>
+        </w:rPr>
+      </w:pPr>
+      <w:r>
+        <w:rPr>
+          <w:lang w:val="en-US"/>
+        </w:rPr>
+        <w:t>RF10 – acc 35.05% eff 27.83%</w:t>
+      </w:r>
     </w:p>
     <w:p>
       <w:r>
@@ -128,10 +548,7 @@
         </w:numPr>
       </w:pPr>
       <w:r>
-        <w:t>Высота</w:t>
-      </w:r>
-      <w:r>
-        <w:t xml:space="preserve"> изображений в пикселях.</w:t>
+        <w:t>Высота изображений в пикселях.</w:t>
       </w:r>
     </w:p>
     <w:p>
@@ -346,19 +763,7 @@
         <w:ind w:left="360"/>
       </w:pPr>
       <w:r>
-        <w:t>Приложение должно</w:t>
-      </w:r>
-      <w:r>
-        <w:t xml:space="preserve"> дела</w:t>
-      </w:r>
-      <w:r>
-        <w:t>ть</w:t>
-      </w:r>
-      <w:r>
-        <w:t xml:space="preserve"> следующее</w:t>
-      </w:r>
-      <w:r>
-        <w:t>:</w:t>
+        <w:t>Приложение должно делать следующее:</w:t>
       </w:r>
     </w:p>
     <w:p>
@@ -475,6 +880,7 @@
         <w:rPr>
           <w:lang w:val="en-US"/>
         </w:rPr>
+        <w:lastRenderedPageBreak/>
         <w:t>Vmax</w:t>
       </w:r>
       <w:r>
@@ -526,10 +932,7 @@
         <w:t xml:space="preserve"> выше</w:t>
       </w:r>
       <w:r>
-        <w:t xml:space="preserve">). </w:t>
-      </w:r>
-      <w:r>
-        <w:t xml:space="preserve">Для режима </w:t>
+        <w:t xml:space="preserve">). Для режима </w:t>
       </w:r>
       <w:r>
         <w:rPr>
@@ -556,10 +959,7 @@
         <w:t>Vmax</w:t>
       </w:r>
       <w:r>
-        <w:t xml:space="preserve"> </w:t>
-      </w:r>
-      <w:r>
-        <w:t>таково, что число значений сверток, больших</w:t>
+        <w:t xml:space="preserve"> таково, что число значений сверток, больших</w:t>
       </w:r>
       <w:r>
         <w:t>,</w:t>
@@ -616,10 +1016,7 @@
         <w:t>sparsity</w:t>
       </w:r>
       <w:r>
-        <w:t xml:space="preserve"> нужно для каждого фильтра вывести</w:t>
-      </w:r>
-      <w:r>
-        <w:t xml:space="preserve"> </w:t>
+        <w:t xml:space="preserve"> нужно для каждого фильтра вывести </w:t>
       </w:r>
       <w:r>
         <w:rPr>
@@ -637,10 +1034,7 @@
         <w:t>Vmax</w:t>
       </w:r>
       <w:r>
-        <w:t>.</w:t>
-      </w:r>
-      <w:r>
-        <w:t xml:space="preserve"> Для режима </w:t>
+        <w:t xml:space="preserve">. Для режима </w:t>
       </w:r>
       <w:r>
         <w:rPr>
@@ -667,16 +1061,7 @@
         <w:t>Vmax</w:t>
       </w:r>
       <w:r>
-        <w:t xml:space="preserve"> и </w:t>
-      </w:r>
-      <w:r>
-        <w:t xml:space="preserve">среднее число спайков </w:t>
-      </w:r>
-      <w:r>
-        <w:t>для всех сверток с данным фильтром по всем изображениям</w:t>
-      </w:r>
-      <w:r>
-        <w:t>.</w:t>
+        <w:t xml:space="preserve"> и среднее число спайков для всех сверток с данным фильтром по всем изображениям.</w:t>
       </w:r>
     </w:p>
     <w:p>

</xml_diff>